<commit_message>
simplify and remove wingspot lum
</commit_message>
<xml_diff>
--- a/results/tables/Age_color_models_table.docx
+++ b/results/tables/Age_color_models_table.docx
@@ -361,151 +361,151 @@
                 <w:rFonts w:ascii="Calibri" w:hAnsi="Calibri"/>
                 <w:sz w:val="20"/>
               </w:rPr>
-              <w:t xml:space="default">Crown luminance</w:t>
-            </w:r>
-          </w:p>
-        </w:tc>
-        <w:tc>
-          <w:tcPr>
-            <w:tcBorders>
-              <w:top w:val="single" w:space="0" w:color="D3D3D3"/>
-              <w:bottom w:val="single" w:space="0" w:color="D3D3D3"/>
-              <w:start w:val="single" w:space="0" w:color="D3D3D3"/>
-              <w:end w:val="single" w:space="0" w:color="D3D3D3"/>
-            </w:tcBorders>
-          </w:tcPr>
-          <w:p>
-            <w:pPr>
-              <w:spacing w:before="0" w:after="60"/>
-              <w:keepNext/>
-              <w:jc w:val="end"/>
-            </w:pPr>
-            <w:r>
-              <w:rPr>
-                <w:rFonts w:ascii="Calibri" w:hAnsi="Calibri"/>
-                <w:sz w:val="20"/>
-              </w:rPr>
-              <w:t xml:space="default">113</w:t>
-            </w:r>
-          </w:p>
-        </w:tc>
-        <w:tc>
-          <w:tcPr>
-            <w:tcBorders>
-              <w:top w:val="single" w:space="0" w:color="D3D3D3"/>
-              <w:bottom w:val="single" w:space="0" w:color="D3D3D3"/>
-              <w:start w:val="single" w:space="0" w:color="D3D3D3"/>
-              <w:end w:val="single" w:space="0" w:color="D3D3D3"/>
-            </w:tcBorders>
-          </w:tcPr>
-          <w:p>
-            <w:pPr>
-              <w:spacing w:before="0" w:after="60"/>
-              <w:keepNext/>
-              <w:jc w:val="end"/>
-            </w:pPr>
-            <w:r>
-              <w:rPr>
-                <w:rFonts w:ascii="Calibri" w:hAnsi="Calibri"/>
-                <w:sz w:val="20"/>
-              </w:rPr>
-              <w:t xml:space="default">0.0717 (0.010)</w:t>
-            </w:r>
-          </w:p>
-        </w:tc>
-        <w:tc>
-          <w:tcPr>
-            <w:tcBorders>
-              <w:top w:val="single" w:space="0" w:color="D3D3D3"/>
-              <w:bottom w:val="single" w:space="0" w:color="D3D3D3"/>
-              <w:start w:val="single" w:space="0" w:color="D3D3D3"/>
-              <w:end w:val="single" w:space="0" w:color="D3D3D3"/>
-            </w:tcBorders>
-          </w:tcPr>
-          <w:p>
-            <w:pPr>
-              <w:spacing w:before="0" w:after="60"/>
-              <w:keepNext/>
-              <w:jc w:val="end"/>
-            </w:pPr>
-            <w:r>
-              <w:rPr>
-                <w:rFonts w:ascii="Calibri" w:hAnsi="Calibri"/>
-                <w:sz w:val="20"/>
-              </w:rPr>
-              <w:t xml:space="default">72</w:t>
-            </w:r>
-          </w:p>
-        </w:tc>
-        <w:tc>
-          <w:tcPr>
-            <w:tcBorders>
-              <w:top w:val="single" w:space="0" w:color="D3D3D3"/>
-              <w:bottom w:val="single" w:space="0" w:color="D3D3D3"/>
-              <w:start w:val="single" w:space="0" w:color="D3D3D3"/>
-              <w:end w:val="single" w:space="0" w:color="D3D3D3"/>
-            </w:tcBorders>
-          </w:tcPr>
-          <w:p>
-            <w:pPr>
-              <w:spacing w:before="0" w:after="60"/>
-              <w:keepNext/>
-              <w:jc w:val="end"/>
-            </w:pPr>
-            <w:r>
-              <w:rPr>
-                <w:rFonts w:ascii="Calibri" w:hAnsi="Calibri"/>
-                <w:sz w:val="20"/>
-              </w:rPr>
-              <w:t xml:space="default">0.0719 (0.011)</w:t>
-            </w:r>
-          </w:p>
-        </w:tc>
-        <w:tc>
-          <w:tcPr>
-            <w:tcBorders>
-              <w:top w:val="single" w:space="0" w:color="D3D3D3"/>
-              <w:bottom w:val="single" w:space="0" w:color="D3D3D3"/>
-              <w:start w:val="single" w:space="0" w:color="D3D3D3"/>
-              <w:end w:val="single" w:space="0" w:color="D3D3D3"/>
-            </w:tcBorders>
-          </w:tcPr>
-          <w:p>
-            <w:pPr>
-              <w:spacing w:before="0" w:after="60"/>
-              <w:keepNext/>
-              <w:jc w:val="end"/>
-            </w:pPr>
-            <w:r>
-              <w:rPr>
-                <w:rFonts w:ascii="Calibri" w:hAnsi="Calibri"/>
-                <w:sz w:val="20"/>
-              </w:rPr>
-              <w:t xml:space="default">-0.11</w:t>
-            </w:r>
-          </w:p>
-        </w:tc>
-        <w:tc>
-          <w:tcPr>
-            <w:tcBorders>
-              <w:top w:val="single" w:space="0" w:color="D3D3D3"/>
-              <w:bottom w:val="single" w:space="0" w:color="D3D3D3"/>
-              <w:start w:val="single" w:space="0" w:color="D3D3D3"/>
-              <w:end w:val="single" w:space="0" w:color="D3D3D3"/>
-            </w:tcBorders>
-          </w:tcPr>
-          <w:p>
-            <w:pPr>
-              <w:spacing w:before="0" w:after="60"/>
-              <w:keepNext/>
-              <w:jc w:val="end"/>
-            </w:pPr>
-            <w:r>
-              <w:rPr>
-                <w:rFonts w:ascii="Calibri" w:hAnsi="Calibri"/>
-                <w:sz w:val="20"/>
-              </w:rPr>
-              <w:t xml:space="default">146.0</w:t>
+              <w:t xml:space="default">Mantle luminance</w:t>
+            </w:r>
+          </w:p>
+        </w:tc>
+        <w:tc>
+          <w:tcPr>
+            <w:tcBorders>
+              <w:top w:val="single" w:space="0" w:color="D3D3D3"/>
+              <w:bottom w:val="single" w:space="0" w:color="D3D3D3"/>
+              <w:start w:val="single" w:space="0" w:color="D3D3D3"/>
+              <w:end w:val="single" w:space="0" w:color="D3D3D3"/>
+            </w:tcBorders>
+          </w:tcPr>
+          <w:p>
+            <w:pPr>
+              <w:spacing w:before="0" w:after="60"/>
+              <w:keepNext/>
+              <w:jc w:val="end"/>
+            </w:pPr>
+            <w:r>
+              <w:rPr>
+                <w:rFonts w:ascii="Calibri" w:hAnsi="Calibri"/>
+                <w:sz w:val="20"/>
+              </w:rPr>
+              <w:t xml:space="default">112</w:t>
+            </w:r>
+          </w:p>
+        </w:tc>
+        <w:tc>
+          <w:tcPr>
+            <w:tcBorders>
+              <w:top w:val="single" w:space="0" w:color="D3D3D3"/>
+              <w:bottom w:val="single" w:space="0" w:color="D3D3D3"/>
+              <w:start w:val="single" w:space="0" w:color="D3D3D3"/>
+              <w:end w:val="single" w:space="0" w:color="D3D3D3"/>
+            </w:tcBorders>
+          </w:tcPr>
+          <w:p>
+            <w:pPr>
+              <w:spacing w:before="0" w:after="60"/>
+              <w:keepNext/>
+              <w:jc w:val="end"/>
+            </w:pPr>
+            <w:r>
+              <w:rPr>
+                <w:rFonts w:ascii="Calibri" w:hAnsi="Calibri"/>
+                <w:sz w:val="20"/>
+              </w:rPr>
+              <w:t xml:space="default">0.0635 (0.012)</w:t>
+            </w:r>
+          </w:p>
+        </w:tc>
+        <w:tc>
+          <w:tcPr>
+            <w:tcBorders>
+              <w:top w:val="single" w:space="0" w:color="D3D3D3"/>
+              <w:bottom w:val="single" w:space="0" w:color="D3D3D3"/>
+              <w:start w:val="single" w:space="0" w:color="D3D3D3"/>
+              <w:end w:val="single" w:space="0" w:color="D3D3D3"/>
+            </w:tcBorders>
+          </w:tcPr>
+          <w:p>
+            <w:pPr>
+              <w:spacing w:before="0" w:after="60"/>
+              <w:keepNext/>
+              <w:jc w:val="end"/>
+            </w:pPr>
+            <w:r>
+              <w:rPr>
+                <w:rFonts w:ascii="Calibri" w:hAnsi="Calibri"/>
+                <w:sz w:val="20"/>
+              </w:rPr>
+              <w:t xml:space="default">70</w:t>
+            </w:r>
+          </w:p>
+        </w:tc>
+        <w:tc>
+          <w:tcPr>
+            <w:tcBorders>
+              <w:top w:val="single" w:space="0" w:color="D3D3D3"/>
+              <w:bottom w:val="single" w:space="0" w:color="D3D3D3"/>
+              <w:start w:val="single" w:space="0" w:color="D3D3D3"/>
+              <w:end w:val="single" w:space="0" w:color="D3D3D3"/>
+            </w:tcBorders>
+          </w:tcPr>
+          <w:p>
+            <w:pPr>
+              <w:spacing w:before="0" w:after="60"/>
+              <w:keepNext/>
+              <w:jc w:val="end"/>
+            </w:pPr>
+            <w:r>
+              <w:rPr>
+                <w:rFonts w:ascii="Calibri" w:hAnsi="Calibri"/>
+                <w:sz w:val="20"/>
+              </w:rPr>
+              <w:t xml:space="default">0.0726 (0.0079)</w:t>
+            </w:r>
+          </w:p>
+        </w:tc>
+        <w:tc>
+          <w:tcPr>
+            <w:tcBorders>
+              <w:top w:val="single" w:space="0" w:color="D3D3D3"/>
+              <w:bottom w:val="single" w:space="0" w:color="D3D3D3"/>
+              <w:start w:val="single" w:space="0" w:color="D3D3D3"/>
+              <w:end w:val="single" w:space="0" w:color="D3D3D3"/>
+            </w:tcBorders>
+          </w:tcPr>
+          <w:p>
+            <w:pPr>
+              <w:spacing w:before="0" w:after="60"/>
+              <w:keepNext/>
+              <w:jc w:val="end"/>
+            </w:pPr>
+            <w:r>
+              <w:rPr>
+                <w:rFonts w:ascii="Calibri" w:hAnsi="Calibri"/>
+                <w:sz w:val="20"/>
+              </w:rPr>
+              <w:t xml:space="default">-6.21</w:t>
+            </w:r>
+          </w:p>
+        </w:tc>
+        <w:tc>
+          <w:tcPr>
+            <w:tcBorders>
+              <w:top w:val="single" w:space="0" w:color="D3D3D3"/>
+              <w:bottom w:val="single" w:space="0" w:color="D3D3D3"/>
+              <w:start w:val="single" w:space="0" w:color="D3D3D3"/>
+              <w:end w:val="single" w:space="0" w:color="D3D3D3"/>
+            </w:tcBorders>
+          </w:tcPr>
+          <w:p>
+            <w:pPr>
+              <w:spacing w:before="0" w:after="60"/>
+              <w:keepNext/>
+              <w:jc w:val="end"/>
+            </w:pPr>
+            <w:r>
+              <w:rPr>
+                <w:rFonts w:ascii="Calibri" w:hAnsi="Calibri"/>
+                <w:sz w:val="20"/>
+              </w:rPr>
+              <w:t xml:space="default">179.3</w:t>
             </w:r>
           </w:p>
         </w:tc>
@@ -529,7 +529,7 @@
                 <w:rFonts w:ascii="Calibri" w:hAnsi="Calibri"/>
                 <w:sz w:val="20"/>
               </w:rPr>
-              <w:t xml:space="default">0.92</w:t>
+              <w:t xml:space="default">&lt; 0.001</w:t>
             </w:r>
           </w:p>
         </w:tc>
@@ -558,151 +558,151 @@
                 <w:rFonts w:ascii="Calibri" w:hAnsi="Calibri"/>
                 <w:sz w:val="20"/>
               </w:rPr>
-              <w:t xml:space="default">Covert luminance</w:t>
-            </w:r>
-          </w:p>
-        </w:tc>
-        <w:tc>
-          <w:tcPr>
-            <w:tcBorders>
-              <w:top w:val="single" w:space="0" w:color="D3D3D3"/>
-              <w:bottom w:val="single" w:space="0" w:color="D3D3D3"/>
-              <w:start w:val="single" w:space="0" w:color="D3D3D3"/>
-              <w:end w:val="single" w:space="0" w:color="D3D3D3"/>
-            </w:tcBorders>
-          </w:tcPr>
-          <w:p>
-            <w:pPr>
-              <w:spacing w:before="0" w:after="60"/>
-              <w:keepNext/>
-              <w:jc w:val="end"/>
-            </w:pPr>
-            <w:r>
-              <w:rPr>
-                <w:rFonts w:ascii="Calibri" w:hAnsi="Calibri"/>
-                <w:sz w:val="20"/>
-              </w:rPr>
-              <w:t xml:space="default">110</w:t>
-            </w:r>
-          </w:p>
-        </w:tc>
-        <w:tc>
-          <w:tcPr>
-            <w:tcBorders>
-              <w:top w:val="single" w:space="0" w:color="D3D3D3"/>
-              <w:bottom w:val="single" w:space="0" w:color="D3D3D3"/>
-              <w:start w:val="single" w:space="0" w:color="D3D3D3"/>
-              <w:end w:val="single" w:space="0" w:color="D3D3D3"/>
-            </w:tcBorders>
-          </w:tcPr>
-          <w:p>
-            <w:pPr>
-              <w:spacing w:before="0" w:after="60"/>
-              <w:keepNext/>
-              <w:jc w:val="end"/>
-            </w:pPr>
-            <w:r>
-              <w:rPr>
-                <w:rFonts w:ascii="Calibri" w:hAnsi="Calibri"/>
-                <w:sz w:val="20"/>
-              </w:rPr>
-              <w:t xml:space="default">0.0705 (0.012)</w:t>
-            </w:r>
-          </w:p>
-        </w:tc>
-        <w:tc>
-          <w:tcPr>
-            <w:tcBorders>
-              <w:top w:val="single" w:space="0" w:color="D3D3D3"/>
-              <w:bottom w:val="single" w:space="0" w:color="D3D3D3"/>
-              <w:start w:val="single" w:space="0" w:color="D3D3D3"/>
-              <w:end w:val="single" w:space="0" w:color="D3D3D3"/>
-            </w:tcBorders>
-          </w:tcPr>
-          <w:p>
-            <w:pPr>
-              <w:spacing w:before="0" w:after="60"/>
-              <w:keepNext/>
-              <w:jc w:val="end"/>
-            </w:pPr>
-            <w:r>
-              <w:rPr>
-                <w:rFonts w:ascii="Calibri" w:hAnsi="Calibri"/>
-                <w:sz w:val="20"/>
-              </w:rPr>
-              <w:t xml:space="default">70</w:t>
-            </w:r>
-          </w:p>
-        </w:tc>
-        <w:tc>
-          <w:tcPr>
-            <w:tcBorders>
-              <w:top w:val="single" w:space="0" w:color="D3D3D3"/>
-              <w:bottom w:val="single" w:space="0" w:color="D3D3D3"/>
-              <w:start w:val="single" w:space="0" w:color="D3D3D3"/>
-              <w:end w:val="single" w:space="0" w:color="D3D3D3"/>
-            </w:tcBorders>
-          </w:tcPr>
-          <w:p>
-            <w:pPr>
-              <w:spacing w:before="0" w:after="60"/>
-              <w:keepNext/>
-              <w:jc w:val="end"/>
-            </w:pPr>
-            <w:r>
-              <w:rPr>
-                <w:rFonts w:ascii="Calibri" w:hAnsi="Calibri"/>
-                <w:sz w:val="20"/>
-              </w:rPr>
-              <w:t xml:space="default">0.0887 (0.015)</w:t>
-            </w:r>
-          </w:p>
-        </w:tc>
-        <w:tc>
-          <w:tcPr>
-            <w:tcBorders>
-              <w:top w:val="single" w:space="0" w:color="D3D3D3"/>
-              <w:bottom w:val="single" w:space="0" w:color="D3D3D3"/>
-              <w:start w:val="single" w:space="0" w:color="D3D3D3"/>
-              <w:end w:val="single" w:space="0" w:color="D3D3D3"/>
-            </w:tcBorders>
-          </w:tcPr>
-          <w:p>
-            <w:pPr>
-              <w:spacing w:before="0" w:after="60"/>
-              <w:keepNext/>
-              <w:jc w:val="end"/>
-            </w:pPr>
-            <w:r>
-              <w:rPr>
-                <w:rFonts w:ascii="Calibri" w:hAnsi="Calibri"/>
-                <w:sz w:val="20"/>
-              </w:rPr>
-              <w:t xml:space="default">-8.34</w:t>
-            </w:r>
-          </w:p>
-        </w:tc>
-        <w:tc>
-          <w:tcPr>
-            <w:tcBorders>
-              <w:top w:val="single" w:space="0" w:color="D3D3D3"/>
-              <w:bottom w:val="single" w:space="0" w:color="D3D3D3"/>
-              <w:start w:val="single" w:space="0" w:color="D3D3D3"/>
-              <w:end w:val="single" w:space="0" w:color="D3D3D3"/>
-            </w:tcBorders>
-          </w:tcPr>
-          <w:p>
-            <w:pPr>
-              <w:spacing w:before="0" w:after="60"/>
-              <w:keepNext/>
-              <w:jc w:val="end"/>
-            </w:pPr>
-            <w:r>
-              <w:rPr>
-                <w:rFonts w:ascii="Calibri" w:hAnsi="Calibri"/>
-                <w:sz w:val="20"/>
-              </w:rPr>
-              <w:t xml:space="default">122.8</w:t>
+              <w:t xml:space="default">Crown luminance</w:t>
+            </w:r>
+          </w:p>
+        </w:tc>
+        <w:tc>
+          <w:tcPr>
+            <w:tcBorders>
+              <w:top w:val="single" w:space="0" w:color="D3D3D3"/>
+              <w:bottom w:val="single" w:space="0" w:color="D3D3D3"/>
+              <w:start w:val="single" w:space="0" w:color="D3D3D3"/>
+              <w:end w:val="single" w:space="0" w:color="D3D3D3"/>
+            </w:tcBorders>
+          </w:tcPr>
+          <w:p>
+            <w:pPr>
+              <w:spacing w:before="0" w:after="60"/>
+              <w:keepNext/>
+              <w:jc w:val="end"/>
+            </w:pPr>
+            <w:r>
+              <w:rPr>
+                <w:rFonts w:ascii="Calibri" w:hAnsi="Calibri"/>
+                <w:sz w:val="20"/>
+              </w:rPr>
+              <w:t xml:space="default">113</w:t>
+            </w:r>
+          </w:p>
+        </w:tc>
+        <w:tc>
+          <w:tcPr>
+            <w:tcBorders>
+              <w:top w:val="single" w:space="0" w:color="D3D3D3"/>
+              <w:bottom w:val="single" w:space="0" w:color="D3D3D3"/>
+              <w:start w:val="single" w:space="0" w:color="D3D3D3"/>
+              <w:end w:val="single" w:space="0" w:color="D3D3D3"/>
+            </w:tcBorders>
+          </w:tcPr>
+          <w:p>
+            <w:pPr>
+              <w:spacing w:before="0" w:after="60"/>
+              <w:keepNext/>
+              <w:jc w:val="end"/>
+            </w:pPr>
+            <w:r>
+              <w:rPr>
+                <w:rFonts w:ascii="Calibri" w:hAnsi="Calibri"/>
+                <w:sz w:val="20"/>
+              </w:rPr>
+              <w:t xml:space="default">0.0717 (0.010)</w:t>
+            </w:r>
+          </w:p>
+        </w:tc>
+        <w:tc>
+          <w:tcPr>
+            <w:tcBorders>
+              <w:top w:val="single" w:space="0" w:color="D3D3D3"/>
+              <w:bottom w:val="single" w:space="0" w:color="D3D3D3"/>
+              <w:start w:val="single" w:space="0" w:color="D3D3D3"/>
+              <w:end w:val="single" w:space="0" w:color="D3D3D3"/>
+            </w:tcBorders>
+          </w:tcPr>
+          <w:p>
+            <w:pPr>
+              <w:spacing w:before="0" w:after="60"/>
+              <w:keepNext/>
+              <w:jc w:val="end"/>
+            </w:pPr>
+            <w:r>
+              <w:rPr>
+                <w:rFonts w:ascii="Calibri" w:hAnsi="Calibri"/>
+                <w:sz w:val="20"/>
+              </w:rPr>
+              <w:t xml:space="default">72</w:t>
+            </w:r>
+          </w:p>
+        </w:tc>
+        <w:tc>
+          <w:tcPr>
+            <w:tcBorders>
+              <w:top w:val="single" w:space="0" w:color="D3D3D3"/>
+              <w:bottom w:val="single" w:space="0" w:color="D3D3D3"/>
+              <w:start w:val="single" w:space="0" w:color="D3D3D3"/>
+              <w:end w:val="single" w:space="0" w:color="D3D3D3"/>
+            </w:tcBorders>
+          </w:tcPr>
+          <w:p>
+            <w:pPr>
+              <w:spacing w:before="0" w:after="60"/>
+              <w:keepNext/>
+              <w:jc w:val="end"/>
+            </w:pPr>
+            <w:r>
+              <w:rPr>
+                <w:rFonts w:ascii="Calibri" w:hAnsi="Calibri"/>
+                <w:sz w:val="20"/>
+              </w:rPr>
+              <w:t xml:space="default">0.0719 (0.011)</w:t>
+            </w:r>
+          </w:p>
+        </w:tc>
+        <w:tc>
+          <w:tcPr>
+            <w:tcBorders>
+              <w:top w:val="single" w:space="0" w:color="D3D3D3"/>
+              <w:bottom w:val="single" w:space="0" w:color="D3D3D3"/>
+              <w:start w:val="single" w:space="0" w:color="D3D3D3"/>
+              <w:end w:val="single" w:space="0" w:color="D3D3D3"/>
+            </w:tcBorders>
+          </w:tcPr>
+          <w:p>
+            <w:pPr>
+              <w:spacing w:before="0" w:after="60"/>
+              <w:keepNext/>
+              <w:jc w:val="end"/>
+            </w:pPr>
+            <w:r>
+              <w:rPr>
+                <w:rFonts w:ascii="Calibri" w:hAnsi="Calibri"/>
+                <w:sz w:val="20"/>
+              </w:rPr>
+              <w:t xml:space="default">-0.11</w:t>
+            </w:r>
+          </w:p>
+        </w:tc>
+        <w:tc>
+          <w:tcPr>
+            <w:tcBorders>
+              <w:top w:val="single" w:space="0" w:color="D3D3D3"/>
+              <w:bottom w:val="single" w:space="0" w:color="D3D3D3"/>
+              <w:start w:val="single" w:space="0" w:color="D3D3D3"/>
+              <w:end w:val="single" w:space="0" w:color="D3D3D3"/>
+            </w:tcBorders>
+          </w:tcPr>
+          <w:p>
+            <w:pPr>
+              <w:spacing w:before="0" w:after="60"/>
+              <w:keepNext/>
+              <w:jc w:val="end"/>
+            </w:pPr>
+            <w:r>
+              <w:rPr>
+                <w:rFonts w:ascii="Calibri" w:hAnsi="Calibri"/>
+                <w:sz w:val="20"/>
+              </w:rPr>
+              <w:t xml:space="default">146.0</w:t>
             </w:r>
           </w:p>
         </w:tc>
@@ -726,7 +726,7 @@
                 <w:rFonts w:ascii="Calibri" w:hAnsi="Calibri"/>
                 <w:sz w:val="20"/>
               </w:rPr>
-              <w:t xml:space="default">&lt; 0.001</w:t>
+              <w:t xml:space="default">0.92</w:t>
             </w:r>
           </w:p>
         </w:tc>
@@ -755,55 +755,55 @@
                 <w:rFonts w:ascii="Calibri" w:hAnsi="Calibri"/>
                 <w:sz w:val="20"/>
               </w:rPr>
-              <w:t xml:space="default">Mantle luminance</w:t>
-            </w:r>
-          </w:p>
-        </w:tc>
-        <w:tc>
-          <w:tcPr>
-            <w:tcBorders>
-              <w:top w:val="single" w:space="0" w:color="D3D3D3"/>
-              <w:bottom w:val="single" w:space="0" w:color="D3D3D3"/>
-              <w:start w:val="single" w:space="0" w:color="D3D3D3"/>
-              <w:end w:val="single" w:space="0" w:color="D3D3D3"/>
-            </w:tcBorders>
-          </w:tcPr>
-          <w:p>
-            <w:pPr>
-              <w:spacing w:before="0" w:after="60"/>
-              <w:keepNext/>
-              <w:jc w:val="end"/>
-            </w:pPr>
-            <w:r>
-              <w:rPr>
-                <w:rFonts w:ascii="Calibri" w:hAnsi="Calibri"/>
-                <w:sz w:val="20"/>
-              </w:rPr>
-              <w:t xml:space="default">112</w:t>
-            </w:r>
-          </w:p>
-        </w:tc>
-        <w:tc>
-          <w:tcPr>
-            <w:tcBorders>
-              <w:top w:val="single" w:space="0" w:color="D3D3D3"/>
-              <w:bottom w:val="single" w:space="0" w:color="D3D3D3"/>
-              <w:start w:val="single" w:space="0" w:color="D3D3D3"/>
-              <w:end w:val="single" w:space="0" w:color="D3D3D3"/>
-            </w:tcBorders>
-          </w:tcPr>
-          <w:p>
-            <w:pPr>
-              <w:spacing w:before="0" w:after="60"/>
-              <w:keepNext/>
-              <w:jc w:val="end"/>
-            </w:pPr>
-            <w:r>
-              <w:rPr>
-                <w:rFonts w:ascii="Calibri" w:hAnsi="Calibri"/>
-                <w:sz w:val="20"/>
-              </w:rPr>
-              <w:t xml:space="default">0.0635 (0.012)</w:t>
+              <w:t xml:space="default">Covert luminance</w:t>
+            </w:r>
+          </w:p>
+        </w:tc>
+        <w:tc>
+          <w:tcPr>
+            <w:tcBorders>
+              <w:top w:val="single" w:space="0" w:color="D3D3D3"/>
+              <w:bottom w:val="single" w:space="0" w:color="D3D3D3"/>
+              <w:start w:val="single" w:space="0" w:color="D3D3D3"/>
+              <w:end w:val="single" w:space="0" w:color="D3D3D3"/>
+            </w:tcBorders>
+          </w:tcPr>
+          <w:p>
+            <w:pPr>
+              <w:spacing w:before="0" w:after="60"/>
+              <w:keepNext/>
+              <w:jc w:val="end"/>
+            </w:pPr>
+            <w:r>
+              <w:rPr>
+                <w:rFonts w:ascii="Calibri" w:hAnsi="Calibri"/>
+                <w:sz w:val="20"/>
+              </w:rPr>
+              <w:t xml:space="default">110</w:t>
+            </w:r>
+          </w:p>
+        </w:tc>
+        <w:tc>
+          <w:tcPr>
+            <w:tcBorders>
+              <w:top w:val="single" w:space="0" w:color="D3D3D3"/>
+              <w:bottom w:val="single" w:space="0" w:color="D3D3D3"/>
+              <w:start w:val="single" w:space="0" w:color="D3D3D3"/>
+              <w:end w:val="single" w:space="0" w:color="D3D3D3"/>
+            </w:tcBorders>
+          </w:tcPr>
+          <w:p>
+            <w:pPr>
+              <w:spacing w:before="0" w:after="60"/>
+              <w:keepNext/>
+              <w:jc w:val="end"/>
+            </w:pPr>
+            <w:r>
+              <w:rPr>
+                <w:rFonts w:ascii="Calibri" w:hAnsi="Calibri"/>
+                <w:sz w:val="20"/>
+              </w:rPr>
+              <w:t xml:space="default">0.0705 (0.012)</w:t>
             </w:r>
           </w:p>
         </w:tc>
@@ -851,55 +851,55 @@
                 <w:rFonts w:ascii="Calibri" w:hAnsi="Calibri"/>
                 <w:sz w:val="20"/>
               </w:rPr>
-              <w:t xml:space="default">0.0726 (0.0079)</w:t>
-            </w:r>
-          </w:p>
-        </w:tc>
-        <w:tc>
-          <w:tcPr>
-            <w:tcBorders>
-              <w:top w:val="single" w:space="0" w:color="D3D3D3"/>
-              <w:bottom w:val="single" w:space="0" w:color="D3D3D3"/>
-              <w:start w:val="single" w:space="0" w:color="D3D3D3"/>
-              <w:end w:val="single" w:space="0" w:color="D3D3D3"/>
-            </w:tcBorders>
-          </w:tcPr>
-          <w:p>
-            <w:pPr>
-              <w:spacing w:before="0" w:after="60"/>
-              <w:keepNext/>
-              <w:jc w:val="end"/>
-            </w:pPr>
-            <w:r>
-              <w:rPr>
-                <w:rFonts w:ascii="Calibri" w:hAnsi="Calibri"/>
-                <w:sz w:val="20"/>
-              </w:rPr>
-              <w:t xml:space="default">-6.21</w:t>
-            </w:r>
-          </w:p>
-        </w:tc>
-        <w:tc>
-          <w:tcPr>
-            <w:tcBorders>
-              <w:top w:val="single" w:space="0" w:color="D3D3D3"/>
-              <w:bottom w:val="single" w:space="0" w:color="D3D3D3"/>
-              <w:start w:val="single" w:space="0" w:color="D3D3D3"/>
-              <w:end w:val="single" w:space="0" w:color="D3D3D3"/>
-            </w:tcBorders>
-          </w:tcPr>
-          <w:p>
-            <w:pPr>
-              <w:spacing w:before="0" w:after="60"/>
-              <w:keepNext/>
-              <w:jc w:val="end"/>
-            </w:pPr>
-            <w:r>
-              <w:rPr>
-                <w:rFonts w:ascii="Calibri" w:hAnsi="Calibri"/>
-                <w:sz w:val="20"/>
-              </w:rPr>
-              <w:t xml:space="default">179.3</w:t>
+              <w:t xml:space="default">0.0887 (0.015)</w:t>
+            </w:r>
+          </w:p>
+        </w:tc>
+        <w:tc>
+          <w:tcPr>
+            <w:tcBorders>
+              <w:top w:val="single" w:space="0" w:color="D3D3D3"/>
+              <w:bottom w:val="single" w:space="0" w:color="D3D3D3"/>
+              <w:start w:val="single" w:space="0" w:color="D3D3D3"/>
+              <w:end w:val="single" w:space="0" w:color="D3D3D3"/>
+            </w:tcBorders>
+          </w:tcPr>
+          <w:p>
+            <w:pPr>
+              <w:spacing w:before="0" w:after="60"/>
+              <w:keepNext/>
+              <w:jc w:val="end"/>
+            </w:pPr>
+            <w:r>
+              <w:rPr>
+                <w:rFonts w:ascii="Calibri" w:hAnsi="Calibri"/>
+                <w:sz w:val="20"/>
+              </w:rPr>
+              <w:t xml:space="default">-8.34</w:t>
+            </w:r>
+          </w:p>
+        </w:tc>
+        <w:tc>
+          <w:tcPr>
+            <w:tcBorders>
+              <w:top w:val="single" w:space="0" w:color="D3D3D3"/>
+              <w:bottom w:val="single" w:space="0" w:color="D3D3D3"/>
+              <w:start w:val="single" w:space="0" w:color="D3D3D3"/>
+              <w:end w:val="single" w:space="0" w:color="D3D3D3"/>
+            </w:tcBorders>
+          </w:tcPr>
+          <w:p>
+            <w:pPr>
+              <w:spacing w:before="0" w:after="60"/>
+              <w:keepNext/>
+              <w:jc w:val="end"/>
+            </w:pPr>
+            <w:r>
+              <w:rPr>
+                <w:rFonts w:ascii="Calibri" w:hAnsi="Calibri"/>
+                <w:sz w:val="20"/>
+              </w:rPr>
+              <w:t xml:space="default">122.8</w:t>
             </w:r>
           </w:p>
         </w:tc>
@@ -1097,203 +1097,6 @@
                 <w:sz w:val="20"/>
               </w:rPr>
               <w:t xml:space="default">121.5</w:t>
-            </w:r>
-          </w:p>
-        </w:tc>
-        <w:tc>
-          <w:tcPr>
-            <w:tcBorders>
-              <w:top w:val="single" w:space="0" w:color="D3D3D3"/>
-              <w:bottom w:val="single" w:space="0" w:color="D3D3D3"/>
-              <w:start w:val="single" w:space="0" w:color="D3D3D3"/>
-              <w:end w:val="single" w:space="0" w:color="D3D3D3"/>
-            </w:tcBorders>
-          </w:tcPr>
-          <w:p>
-            <w:pPr>
-              <w:spacing w:before="0" w:after="60"/>
-              <w:keepNext/>
-              <w:jc w:val="start"/>
-            </w:pPr>
-            <w:r>
-              <w:rPr>
-                <w:rFonts w:ascii="Calibri" w:hAnsi="Calibri"/>
-                <w:sz w:val="20"/>
-              </w:rPr>
-              <w:t xml:space="default">&lt; 0.001</w:t>
-            </w:r>
-          </w:p>
-        </w:tc>
-      </w:tr>
-      <w:tr>
-        <w:trPr>
-          <w:cantSplit/>
-        </w:trPr>
-        <w:tc>
-          <w:tcPr>
-            <w:tcBorders>
-              <w:top w:val="single" w:space="0" w:color="D3D3D3"/>
-              <w:bottom w:val="single" w:space="0" w:color="D3D3D3"/>
-              <w:start w:val="single" w:space="0" w:color="D3D3D3"/>
-              <w:end w:val="single" w:space="0" w:color="D3D3D3"/>
-            </w:tcBorders>
-          </w:tcPr>
-          <w:p>
-            <w:pPr>
-              <w:spacing w:before="0" w:after="60"/>
-              <w:keepNext/>
-              <w:jc w:val="start"/>
-            </w:pPr>
-            <w:r>
-              <w:rPr>
-                <w:rFonts w:ascii="Calibri" w:hAnsi="Calibri"/>
-                <w:sz w:val="20"/>
-              </w:rPr>
-              <w:t xml:space="default">Wing spot luminance</w:t>
-            </w:r>
-          </w:p>
-        </w:tc>
-        <w:tc>
-          <w:tcPr>
-            <w:tcBorders>
-              <w:top w:val="single" w:space="0" w:color="D3D3D3"/>
-              <w:bottom w:val="single" w:space="0" w:color="D3D3D3"/>
-              <w:start w:val="single" w:space="0" w:color="D3D3D3"/>
-              <w:end w:val="single" w:space="0" w:color="D3D3D3"/>
-            </w:tcBorders>
-          </w:tcPr>
-          <w:p>
-            <w:pPr>
-              <w:spacing w:before="0" w:after="60"/>
-              <w:keepNext/>
-              <w:jc w:val="end"/>
-            </w:pPr>
-            <w:r>
-              <w:rPr>
-                <w:rFonts w:ascii="Calibri" w:hAnsi="Calibri"/>
-                <w:sz w:val="20"/>
-              </w:rPr>
-              <w:t xml:space="default">112</w:t>
-            </w:r>
-          </w:p>
-        </w:tc>
-        <w:tc>
-          <w:tcPr>
-            <w:tcBorders>
-              <w:top w:val="single" w:space="0" w:color="D3D3D3"/>
-              <w:bottom w:val="single" w:space="0" w:color="D3D3D3"/>
-              <w:start w:val="single" w:space="0" w:color="D3D3D3"/>
-              <w:end w:val="single" w:space="0" w:color="D3D3D3"/>
-            </w:tcBorders>
-          </w:tcPr>
-          <w:p>
-            <w:pPr>
-              <w:spacing w:before="0" w:after="60"/>
-              <w:keepNext/>
-              <w:jc w:val="end"/>
-            </w:pPr>
-            <w:r>
-              <w:rPr>
-                <w:rFonts w:ascii="Calibri" w:hAnsi="Calibri"/>
-                <w:sz w:val="20"/>
-              </w:rPr>
-              <w:t xml:space="default">0.443 (0.045)</w:t>
-            </w:r>
-          </w:p>
-        </w:tc>
-        <w:tc>
-          <w:tcPr>
-            <w:tcBorders>
-              <w:top w:val="single" w:space="0" w:color="D3D3D3"/>
-              <w:bottom w:val="single" w:space="0" w:color="D3D3D3"/>
-              <w:start w:val="single" w:space="0" w:color="D3D3D3"/>
-              <w:end w:val="single" w:space="0" w:color="D3D3D3"/>
-            </w:tcBorders>
-          </w:tcPr>
-          <w:p>
-            <w:pPr>
-              <w:spacing w:before="0" w:after="60"/>
-              <w:keepNext/>
-              <w:jc w:val="end"/>
-            </w:pPr>
-            <w:r>
-              <w:rPr>
-                <w:rFonts w:ascii="Calibri" w:hAnsi="Calibri"/>
-                <w:sz w:val="20"/>
-              </w:rPr>
-              <w:t xml:space="default">70</w:t>
-            </w:r>
-          </w:p>
-        </w:tc>
-        <w:tc>
-          <w:tcPr>
-            <w:tcBorders>
-              <w:top w:val="single" w:space="0" w:color="D3D3D3"/>
-              <w:bottom w:val="single" w:space="0" w:color="D3D3D3"/>
-              <w:start w:val="single" w:space="0" w:color="D3D3D3"/>
-              <w:end w:val="single" w:space="0" w:color="D3D3D3"/>
-            </w:tcBorders>
-          </w:tcPr>
-          <w:p>
-            <w:pPr>
-              <w:spacing w:before="0" w:after="60"/>
-              <w:keepNext/>
-              <w:jc w:val="end"/>
-            </w:pPr>
-            <w:r>
-              <w:rPr>
-                <w:rFonts w:ascii="Calibri" w:hAnsi="Calibri"/>
-                <w:sz w:val="20"/>
-              </w:rPr>
-              <w:t xml:space="default">0.352 (0.060)</w:t>
-            </w:r>
-          </w:p>
-        </w:tc>
-        <w:tc>
-          <w:tcPr>
-            <w:tcBorders>
-              <w:top w:val="single" w:space="0" w:color="D3D3D3"/>
-              <w:bottom w:val="single" w:space="0" w:color="D3D3D3"/>
-              <w:start w:val="single" w:space="0" w:color="D3D3D3"/>
-              <w:end w:val="single" w:space="0" w:color="D3D3D3"/>
-            </w:tcBorders>
-          </w:tcPr>
-          <w:p>
-            <w:pPr>
-              <w:spacing w:before="0" w:after="60"/>
-              <w:keepNext/>
-              <w:jc w:val="end"/>
-            </w:pPr>
-            <w:r>
-              <w:rPr>
-                <w:rFonts w:ascii="Calibri" w:hAnsi="Calibri"/>
-                <w:sz w:val="20"/>
-              </w:rPr>
-              <w:t xml:space="default">10.95</w:t>
-            </w:r>
-          </w:p>
-        </w:tc>
-        <w:tc>
-          <w:tcPr>
-            <w:tcBorders>
-              <w:top w:val="single" w:space="0" w:color="D3D3D3"/>
-              <w:bottom w:val="single" w:space="0" w:color="D3D3D3"/>
-              <w:start w:val="single" w:space="0" w:color="D3D3D3"/>
-              <w:end w:val="single" w:space="0" w:color="D3D3D3"/>
-            </w:tcBorders>
-          </w:tcPr>
-          <w:p>
-            <w:pPr>
-              <w:spacing w:before="0" w:after="60"/>
-              <w:keepNext/>
-              <w:jc w:val="end"/>
-            </w:pPr>
-            <w:r>
-              <w:rPr>
-                <w:rFonts w:ascii="Calibri" w:hAnsi="Calibri"/>
-                <w:sz w:val="20"/>
-              </w:rPr>
-              <w:t xml:space="default">118.2</w:t>
             </w:r>
           </w:p>
         </w:tc>

</xml_diff>

<commit_message>
re-run removing samples that only have crown measurements
</commit_message>
<xml_diff>
--- a/results/tables/Age_color_models_table.docx
+++ b/results/tables/Age_color_models_table.docx
@@ -582,7 +582,7 @@
                 <w:rFonts w:ascii="Calibri" w:hAnsi="Calibri"/>
                 <w:sz w:val="20"/>
               </w:rPr>
-              <w:t xml:space="default">113</w:t>
+              <w:t xml:space="default">112</w:t>
             </w:r>
           </w:p>
         </w:tc>
@@ -630,79 +630,79 @@
                 <w:rFonts w:ascii="Calibri" w:hAnsi="Calibri"/>
                 <w:sz w:val="20"/>
               </w:rPr>
-              <w:t xml:space="default">72</w:t>
-            </w:r>
-          </w:p>
-        </w:tc>
-        <w:tc>
-          <w:tcPr>
-            <w:tcBorders>
-              <w:top w:val="single" w:space="0" w:color="D3D3D3"/>
-              <w:bottom w:val="single" w:space="0" w:color="D3D3D3"/>
-              <w:start w:val="single" w:space="0" w:color="D3D3D3"/>
-              <w:end w:val="single" w:space="0" w:color="D3D3D3"/>
-            </w:tcBorders>
-          </w:tcPr>
-          <w:p>
-            <w:pPr>
-              <w:spacing w:before="0" w:after="60"/>
-              <w:keepNext/>
-              <w:jc w:val="end"/>
-            </w:pPr>
-            <w:r>
-              <w:rPr>
-                <w:rFonts w:ascii="Calibri" w:hAnsi="Calibri"/>
-                <w:sz w:val="20"/>
-              </w:rPr>
-              <w:t xml:space="default">0.0719 (0.011)</w:t>
-            </w:r>
-          </w:p>
-        </w:tc>
-        <w:tc>
-          <w:tcPr>
-            <w:tcBorders>
-              <w:top w:val="single" w:space="0" w:color="D3D3D3"/>
-              <w:bottom w:val="single" w:space="0" w:color="D3D3D3"/>
-              <w:start w:val="single" w:space="0" w:color="D3D3D3"/>
-              <w:end w:val="single" w:space="0" w:color="D3D3D3"/>
-            </w:tcBorders>
-          </w:tcPr>
-          <w:p>
-            <w:pPr>
-              <w:spacing w:before="0" w:after="60"/>
-              <w:keepNext/>
-              <w:jc w:val="end"/>
-            </w:pPr>
-            <w:r>
-              <w:rPr>
-                <w:rFonts w:ascii="Calibri" w:hAnsi="Calibri"/>
-                <w:sz w:val="20"/>
-              </w:rPr>
-              <w:t xml:space="default">-0.11</w:t>
-            </w:r>
-          </w:p>
-        </w:tc>
-        <w:tc>
-          <w:tcPr>
-            <w:tcBorders>
-              <w:top w:val="single" w:space="0" w:color="D3D3D3"/>
-              <w:bottom w:val="single" w:space="0" w:color="D3D3D3"/>
-              <w:start w:val="single" w:space="0" w:color="D3D3D3"/>
-              <w:end w:val="single" w:space="0" w:color="D3D3D3"/>
-            </w:tcBorders>
-          </w:tcPr>
-          <w:p>
-            <w:pPr>
-              <w:spacing w:before="0" w:after="60"/>
-              <w:keepNext/>
-              <w:jc w:val="end"/>
-            </w:pPr>
-            <w:r>
-              <w:rPr>
-                <w:rFonts w:ascii="Calibri" w:hAnsi="Calibri"/>
-                <w:sz w:val="20"/>
-              </w:rPr>
-              <w:t xml:space="default">146.0</w:t>
+              <w:t xml:space="default">71</w:t>
+            </w:r>
+          </w:p>
+        </w:tc>
+        <w:tc>
+          <w:tcPr>
+            <w:tcBorders>
+              <w:top w:val="single" w:space="0" w:color="D3D3D3"/>
+              <w:bottom w:val="single" w:space="0" w:color="D3D3D3"/>
+              <w:start w:val="single" w:space="0" w:color="D3D3D3"/>
+              <w:end w:val="single" w:space="0" w:color="D3D3D3"/>
+            </w:tcBorders>
+          </w:tcPr>
+          <w:p>
+            <w:pPr>
+              <w:spacing w:before="0" w:after="60"/>
+              <w:keepNext/>
+              <w:jc w:val="end"/>
+            </w:pPr>
+            <w:r>
+              <w:rPr>
+                <w:rFonts w:ascii="Calibri" w:hAnsi="Calibri"/>
+                <w:sz w:val="20"/>
+              </w:rPr>
+              <w:t xml:space="default">0.0717 (0.011)</w:t>
+            </w:r>
+          </w:p>
+        </w:tc>
+        <w:tc>
+          <w:tcPr>
+            <w:tcBorders>
+              <w:top w:val="single" w:space="0" w:color="D3D3D3"/>
+              <w:bottom w:val="single" w:space="0" w:color="D3D3D3"/>
+              <w:start w:val="single" w:space="0" w:color="D3D3D3"/>
+              <w:end w:val="single" w:space="0" w:color="D3D3D3"/>
+            </w:tcBorders>
+          </w:tcPr>
+          <w:p>
+            <w:pPr>
+              <w:spacing w:before="0" w:after="60"/>
+              <w:keepNext/>
+              <w:jc w:val="end"/>
+            </w:pPr>
+            <w:r>
+              <w:rPr>
+                <w:rFonts w:ascii="Calibri" w:hAnsi="Calibri"/>
+                <w:sz w:val="20"/>
+              </w:rPr>
+              <w:t xml:space="default">-0.04</w:t>
+            </w:r>
+          </w:p>
+        </w:tc>
+        <w:tc>
+          <w:tcPr>
+            <w:tcBorders>
+              <w:top w:val="single" w:space="0" w:color="D3D3D3"/>
+              <w:bottom w:val="single" w:space="0" w:color="D3D3D3"/>
+              <w:start w:val="single" w:space="0" w:color="D3D3D3"/>
+              <w:end w:val="single" w:space="0" w:color="D3D3D3"/>
+            </w:tcBorders>
+          </w:tcPr>
+          <w:p>
+            <w:pPr>
+              <w:spacing w:before="0" w:after="60"/>
+              <w:keepNext/>
+              <w:jc w:val="end"/>
+            </w:pPr>
+            <w:r>
+              <w:rPr>
+                <w:rFonts w:ascii="Calibri" w:hAnsi="Calibri"/>
+                <w:sz w:val="20"/>
+              </w:rPr>
+              <w:t xml:space="default">144.1</w:t>
             </w:r>
           </w:p>
         </w:tc>
@@ -726,7 +726,7 @@
                 <w:rFonts w:ascii="Calibri" w:hAnsi="Calibri"/>
                 <w:sz w:val="20"/>
               </w:rPr>
-              <w:t xml:space="default">0.92</w:t>
+              <w:t xml:space="default">0.96</w:t>
             </w:r>
           </w:p>
         </w:tc>

</xml_diff>